<commit_message>
feat(itrust-study): publish specification and test suite v8.0
</commit_message>
<xml_diff>
--- a/output/docx/UC14AlertUsersByEmail.docx
+++ b/output/docx/UC14AlertUsersByEmail.docx
@@ -39,7 +39,7 @@
           <w:sz w:val="30"/>
           <w:color w:val="1A365D"/>
         </w:rPr>
-        <w:t>Use Case: UC14 Alert Users by Email (v7.0)</w:t>
+        <w:t>Use Case: UC14 Alert Users by Email (v8.0)</w:t>
       </w:r>
     </w:p>
     <w:p>
@@ -534,164 +534,6 @@
         <w:br/>
       </w:r>
     </w:p>
-    <w:p>
-      <w:pPr>
-        <w:spacing w:before="180" w:after="60"/>
-      </w:pPr>
-      <w:r>
-        <w:rPr>
-          <w:b w:val="on"/>
-          <w:sz w:val="24"/>
-          <w:color w:val="2B6CB0"/>
-        </w:rPr>
-        <w:t>[TC4] Exception Flow 1: No valid email associated with account</w:t>
-      </w:r>
-    </w:p>
-    <w:p>
-      <w:pPr>
-        <w:spacing w:after="40"/>
-      </w:pPr>
-      <w:r>
-        <w:rPr>
-          <w:b w:val="on"/>
-          <w:sz w:val="20"/>
-        </w:rPr>
-        <w:t xml:space="preserve">Preconditions: </w:t>
-      </w:r>
-      <w:r>
-        <w:rPr>
-          <w:sz w:val="20"/>
-        </w:rPr>
-        <w:t>There is an active authenticated session.</w:t>
-      </w:r>
-    </w:p>
-    <w:p>
-      <w:pPr>
-        <w:spacing w:after="40"/>
-      </w:pPr>
-      <w:r>
-        <w:rPr>
-          <w:b w:val="on"/>
-          <w:sz w:val="20"/>
-        </w:rPr>
-        <w:t xml:space="preserve">Postconditions: </w:t>
-      </w:r>
-      <w:r>
-        <w:rPr>
-          <w:sz w:val="20"/>
-        </w:rPr>
-        <w:t>Flow interrupted due to exception / error</w:t>
-      </w:r>
-    </w:p>
-    <w:tbl>
-      <w:tblPr>
-        <w:tblW w:w="5000" w:type="pct"/>
-        <w:tblBorders>
-          <w:top w:val="single"/>
-          <w:left w:val="single"/>
-          <w:bottom w:val="single"/>
-          <w:right w:val="single"/>
-          <w:insideH w:val="single"/>
-          <w:insideV w:val="single"/>
-        </w:tblBorders>
-      </w:tblPr>
-      <w:tr>
-        <w:tc>
-          <w:tcPr>
-            <w:tcW w:w="1200" w:type="dxa"/>
-            <w:shd w:color="auto" w:val="clear" w:fill="2B6CB0"/>
-          </w:tcPr>
-          <w:p>
-            <w:pPr>
-              <w:jc w:val="left"/>
-            </w:pPr>
-            <w:r>
-              <w:rPr>
-                <w:b w:val="on"/>
-                <w:sz w:val="20"/>
-                <w:color w:val="FFFFFF"/>
-              </w:rPr>
-              <w:t>Step #</w:t>
-            </w:r>
-          </w:p>
-        </w:tc>
-        <w:tc>
-          <w:tcPr>
-            <w:tcW w:w="4500" w:type="dxa"/>
-            <w:shd w:color="auto" w:val="clear" w:fill="2B6CB0"/>
-          </w:tcPr>
-          <w:p>
-            <w:pPr>
-              <w:jc w:val="left"/>
-            </w:pPr>
-            <w:r>
-              <w:rPr>
-                <w:b w:val="on"/>
-                <w:sz w:val="20"/>
-                <w:color w:val="FFFFFF"/>
-              </w:rPr>
-              <w:t>Actor Action</w:t>
-            </w:r>
-          </w:p>
-        </w:tc>
-        <w:tc>
-          <w:tcPr>
-            <w:tcW w:w="4500" w:type="dxa"/>
-            <w:shd w:color="auto" w:val="clear" w:fill="2B6CB0"/>
-          </w:tcPr>
-          <w:p>
-            <w:pPr>
-              <w:jc w:val="left"/>
-            </w:pPr>
-            <w:r>
-              <w:rPr>
-                <w:b w:val="on"/>
-                <w:sz w:val="20"/>
-                <w:color w:val="FFFFFF"/>
-              </w:rPr>
-              <w:t>Expected Result (System)</w:t>
-            </w:r>
-          </w:p>
-        </w:tc>
-      </w:tr>
-      <w:tr>
-        <w:tc>
-          <w:p>
-            <w:r>
-              <w:rPr>
-                <w:sz w:val="18"/>
-              </w:rPr>
-              <w:t>1</w:t>
-            </w:r>
-          </w:p>
-        </w:tc>
-        <w:tc>
-          <w:p>
-            <w:r>
-              <w:rPr>
-                <w:sz w:val="18"/>
-              </w:rPr>
-              <w:t>user: The user has successfully changed his/her password (UC11, S1/S2). An email informing the user of the password change is sent to the user including the MID but not the password.</w:t>
-            </w:r>
-          </w:p>
-        </w:tc>
-        <w:tc>
-          <w:p>
-            <w:r>
-              <w:rPr>
-                <w:sz w:val="18"/>
-              </w:rPr>
-              <w:t>SYSTEM prompts that If the user does not have an email address on file, no email is sent and the failure is logged.</w:t>
-            </w:r>
-          </w:p>
-        </w:tc>
-      </w:tr>
-    </w:tbl>
-    <w:p>
-      <w:r>
-        <w:br/>
-      </w:r>
-    </w:p>
   </w:body>
 </w:document>
 </file>
</xml_diff>